<commit_message>
Market relevance added in the project report
</commit_message>
<xml_diff>
--- a/Final Report.docx
+++ b/Final Report.docx
@@ -85,7 +85,7 @@
                         </pic:cNvPicPr>
                       </pic:nvPicPr>
                       <pic:blipFill>
-                        <a:blip r:embed="rId7"/>
+                        <a:blip r:embed="rId8"/>
                         <a:srcRect/>
                         <a:stretch>
                           <a:fillRect/>
@@ -153,7 +153,7 @@
                         </pic:cNvPicPr>
                       </pic:nvPicPr>
                       <pic:blipFill>
-                        <a:blip r:embed="rId8" cstate="print"/>
+                        <a:blip r:embed="rId9" cstate="print"/>
                         <a:srcRect/>
                         <a:stretch>
                           <a:fillRect/>
@@ -3021,7 +3021,7 @@
     <w:p>
       <w:pPr>
         <w:sectPr>
-          <w:footerReference w:type="default" r:id="rId9"/>
+          <w:footerReference w:type="default" r:id="rId10"/>
           <w:pgSz w:w="12240" w:h="15840"/>
           <w:pgMar w:top="1440" w:right="1440" w:bottom="1440" w:left="1440" w:header="720" w:footer="720" w:gutter="0"/>
           <w:pgNumType w:fmt="lowerRoman"/>
@@ -4926,9 +4926,13 @@
     <w:p>
       <w:pPr>
         <w:pStyle w:val="Heading2"/>
+        <w:numPr>
+          <w:ilvl w:val="1"/>
+          <w:numId w:val="2"/>
+        </w:numPr>
       </w:pPr>
       <w:r>
-        <w:t>1.Part 1</w:t>
+        <w:t>Understanding Digital Healthcare: Definitions and Context</w:t>
       </w:r>
     </w:p>
     <w:p>
@@ -4997,8 +5001,76 @@
         <w:t xml:space="preserve"> established digital health as a strategic global priority which requires member states to implement digital technologies into their national health systems to promote equitable access to healthcare (World Health Organization,2021).</w:t>
       </w:r>
     </w:p>
-    <w:p/>
-    <w:p/>
+    <w:p>
+      <w:r>
+        <w:t>2.2 Market Relevance and the Need for an Intelligent System</w:t>
+      </w:r>
+    </w:p>
+    <w:p>
+      <w:r>
+        <w:t>The commercial importance of digital</w:t>
+      </w:r>
+      <w:r>
+        <w:t xml:space="preserve"> healthcare </w:t>
+      </w:r>
+      <w:r>
+        <w:t>platform is illustrated by solid market statistics.</w:t>
+      </w:r>
+      <w:r>
+        <w:t xml:space="preserve"> In 2024, the global telemedicine market was valued at USD 141.19 billion approximately which is </w:t>
+      </w:r>
+      <w:r>
+        <w:t xml:space="preserve">projected to grow to </w:t>
+      </w:r>
+      <w:r>
+        <w:t xml:space="preserve">USD 380.33 billion by 2030 with a compound annual growth of 17.55% (Grand View Research,2024). Similarly, the global </w:t>
+      </w:r>
+      <w:r>
+        <w:t xml:space="preserve">valuation of AI in </w:t>
+      </w:r>
+      <w:r>
+        <w:t xml:space="preserve">healthcare market </w:t>
+      </w:r>
+      <w:r>
+        <w:t xml:space="preserve">was </w:t>
+      </w:r>
+      <w:r>
+        <w:t>USD 26.57 billion in 2024 which</w:t>
+      </w:r>
+      <w:r>
+        <w:t>,</w:t>
+      </w:r>
+      <w:r>
+        <w:t xml:space="preserve"> will </w:t>
+      </w:r>
+      <w:r>
+        <w:t xml:space="preserve">be </w:t>
+      </w:r>
+      <w:r>
+        <w:t xml:space="preserve">USD 505.59 billion </w:t>
+      </w:r>
+      <w:r>
+        <w:t>with</w:t>
+      </w:r>
+      <w:r>
+        <w:t xml:space="preserve"> 38.81% compound annual growth rate</w:t>
+      </w:r>
+      <w:r>
+        <w:t xml:space="preserve"> </w:t>
+      </w:r>
+      <w:r>
+        <w:t xml:space="preserve">(Research and Markets,2024). A study by Microsoft and IDC carried out on 2014 reported that 79% of healthcare organizations are using AI to generate a return of USD 3.20 for </w:t>
+      </w:r>
+      <w:r>
+        <w:t>every USD 1 invested (Grand View Research,2024). This data shows the viability of creating intelligent digital platforms on a larger scale. More than half of the global population still lacks the access to essential health services despite the growth of digital platforms which have the potential to address this gap</w:t>
+      </w:r>
+      <w:r>
+        <w:t xml:space="preserve"> </w:t>
+      </w:r>
+      <w:r>
+        <w:t>(World Health Organization,2021).</w:t>
+      </w:r>
+    </w:p>
     <w:p/>
     <w:p/>
     <w:p/>
@@ -5024,6 +5096,7 @@
       </w:pPr>
       <w:bookmarkStart w:id="9" w:name="_Toc226061231"/>
       <w:r>
+        <w:lastRenderedPageBreak/>
         <w:t>Chapter 3: Review of Technology</w:t>
       </w:r>
       <w:bookmarkEnd w:id="9"/>
@@ -5274,7 +5347,6 @@
                 <w:rPr>
                   <w:noProof/>
                 </w:rPr>
-                <w:lastRenderedPageBreak/>
                 <w:t xml:space="preserve">Hadian, M. et al., 2022. Challenges of Implementing Telemedicine Technology: A systematized Review. </w:t>
               </w:r>
             </w:p>
@@ -5385,6 +5457,7 @@
       </w:pPr>
       <w:bookmarkStart w:id="18" w:name="_Toc226061240"/>
       <w:r>
+        <w:lastRenderedPageBreak/>
         <w:t>Appendices</w:t>
       </w:r>
       <w:bookmarkEnd w:id="18"/>
@@ -5523,6 +5596,219 @@
     </w:p>
   </w:footnote>
 </w:footnotes>
+</file>
+
+<file path=word/numbering.xml><?xml version="1.0" encoding="utf-8"?>
+<w:numbering xmlns:wpc="http://schemas.microsoft.com/office/word/2010/wordprocessingCanvas" xmlns:cx="http://schemas.microsoft.com/office/drawing/2014/chartex" xmlns:cx1="http://schemas.microsoft.com/office/drawing/2015/9/8/chartex" xmlns:cx2="http://schemas.microsoft.com/office/drawing/2015/10/21/chartex" xmlns:cx3="http://schemas.microsoft.com/office/drawing/2016/5/9/chartex" xmlns:cx4="http://schemas.microsoft.com/office/drawing/2016/5/10/chartex" xmlns:cx5="http://schemas.microsoft.com/office/drawing/2016/5/11/chartex" xmlns:cx6="http://schemas.microsoft.com/office/drawing/2016/5/12/chartex" xmlns:cx7="http://schemas.microsoft.com/office/drawing/2016/5/13/chartex" xmlns:cx8="http://schemas.microsoft.com/office/drawing/2016/5/14/chartex" xmlns:mc="http://schemas.openxmlformats.org/markup-compatibility/2006" xmlns:aink="http://schemas.microsoft.com/office/drawing/2016/ink" xmlns:am3d="http://schemas.microsoft.com/office/drawing/2017/model3d" xmlns:o="urn:schemas-microsoft-com:office:office" xmlns:oel="http://schemas.microsoft.com/office/2019/extlst" xmlns:r="http://schemas.openxmlformats.org/officeDocument/2006/relationships" xmlns:m="http://schemas.openxmlformats.org/officeDocument/2006/math" xmlns:v="urn:schemas-microsoft-com:vml" xmlns:wp14="http://schemas.microsoft.com/office/word/2010/wordprocessingDrawing" xmlns:wp="http://schemas.openxmlformats.org/drawingml/2006/wordprocessingDrawing" xmlns:w10="urn:schemas-microsoft-com:office:word" xmlns:w="http://schemas.openxmlformats.org/wordprocessingml/2006/main" xmlns:w14="http://schemas.microsoft.com/office/word/2010/wordml" xmlns:w15="http://schemas.microsoft.com/office/word/2012/wordml" xmlns:w16cex="http://schemas.microsoft.com/office/word/2018/wordml/cex" xmlns:w16cid="http://schemas.microsoft.com/office/word/2016/wordml/cid" xmlns:w16="http://schemas.microsoft.com/office/word/2018/wordml" xmlns:w16du="http://schemas.microsoft.com/office/word/2023/wordml/word16du" xmlns:w16sdtdh="http://schemas.microsoft.com/office/word/2020/wordml/sdtdatahash" xmlns:w16sdtfl="http://schemas.microsoft.com/office/word/2024/wordml/sdtformatlock" xmlns:w16se="http://schemas.microsoft.com/office/word/2015/wordml/symex" xmlns:wpg="http://schemas.microsoft.com/office/word/2010/wordprocessingGroup" xmlns:wpi="http://schemas.microsoft.com/office/word/2010/wordprocessingInk" xmlns:wne="http://schemas.microsoft.com/office/word/2006/wordml" xmlns:wps="http://schemas.microsoft.com/office/word/2010/wordprocessingShape" mc:Ignorable="w14 w15 w16se w16cid w16 w16cex w16sdtdh w16sdtfl w16du wp14">
+  <w:abstractNum w:abstractNumId="0" w15:restartNumberingAfterBreak="0">
+    <w:nsid w:val="054E239E"/>
+    <w:multiLevelType w:val="hybridMultilevel"/>
+    <w:tmpl w:val="2818867E"/>
+    <w:lvl w:ilvl="0" w:tplc="0409000F">
+      <w:start w:val="1"/>
+      <w:numFmt w:val="decimal"/>
+      <w:lvlText w:val="%1."/>
+      <w:lvlJc w:val="left"/>
+      <w:pPr>
+        <w:ind w:left="720" w:hanging="360"/>
+      </w:pPr>
+      <w:rPr>
+        <w:rFonts w:hint="default"/>
+      </w:rPr>
+    </w:lvl>
+    <w:lvl w:ilvl="1" w:tplc="04090019" w:tentative="1">
+      <w:start w:val="1"/>
+      <w:numFmt w:val="lowerLetter"/>
+      <w:lvlText w:val="%2."/>
+      <w:lvlJc w:val="left"/>
+      <w:pPr>
+        <w:ind w:left="1440" w:hanging="360"/>
+      </w:pPr>
+    </w:lvl>
+    <w:lvl w:ilvl="2" w:tplc="0409001B" w:tentative="1">
+      <w:start w:val="1"/>
+      <w:numFmt w:val="lowerRoman"/>
+      <w:lvlText w:val="%3."/>
+      <w:lvlJc w:val="right"/>
+      <w:pPr>
+        <w:ind w:left="2160" w:hanging="180"/>
+      </w:pPr>
+    </w:lvl>
+    <w:lvl w:ilvl="3" w:tplc="0409000F" w:tentative="1">
+      <w:start w:val="1"/>
+      <w:numFmt w:val="decimal"/>
+      <w:lvlText w:val="%4."/>
+      <w:lvlJc w:val="left"/>
+      <w:pPr>
+        <w:ind w:left="2880" w:hanging="360"/>
+      </w:pPr>
+    </w:lvl>
+    <w:lvl w:ilvl="4" w:tplc="04090019" w:tentative="1">
+      <w:start w:val="1"/>
+      <w:numFmt w:val="lowerLetter"/>
+      <w:lvlText w:val="%5."/>
+      <w:lvlJc w:val="left"/>
+      <w:pPr>
+        <w:ind w:left="3600" w:hanging="360"/>
+      </w:pPr>
+    </w:lvl>
+    <w:lvl w:ilvl="5" w:tplc="0409001B" w:tentative="1">
+      <w:start w:val="1"/>
+      <w:numFmt w:val="lowerRoman"/>
+      <w:lvlText w:val="%6."/>
+      <w:lvlJc w:val="right"/>
+      <w:pPr>
+        <w:ind w:left="4320" w:hanging="180"/>
+      </w:pPr>
+    </w:lvl>
+    <w:lvl w:ilvl="6" w:tplc="0409000F" w:tentative="1">
+      <w:start w:val="1"/>
+      <w:numFmt w:val="decimal"/>
+      <w:lvlText w:val="%7."/>
+      <w:lvlJc w:val="left"/>
+      <w:pPr>
+        <w:ind w:left="5040" w:hanging="360"/>
+      </w:pPr>
+    </w:lvl>
+    <w:lvl w:ilvl="7" w:tplc="04090019" w:tentative="1">
+      <w:start w:val="1"/>
+      <w:numFmt w:val="lowerLetter"/>
+      <w:lvlText w:val="%8."/>
+      <w:lvlJc w:val="left"/>
+      <w:pPr>
+        <w:ind w:left="5760" w:hanging="360"/>
+      </w:pPr>
+    </w:lvl>
+    <w:lvl w:ilvl="8" w:tplc="0409001B" w:tentative="1">
+      <w:start w:val="1"/>
+      <w:numFmt w:val="lowerRoman"/>
+      <w:lvlText w:val="%9."/>
+      <w:lvlJc w:val="right"/>
+      <w:pPr>
+        <w:ind w:left="6480" w:hanging="180"/>
+      </w:pPr>
+    </w:lvl>
+  </w:abstractNum>
+  <w:abstractNum w:abstractNumId="1" w15:restartNumberingAfterBreak="0">
+    <w:nsid w:val="7A1A79F8"/>
+    <w:multiLevelType w:val="multilevel"/>
+    <w:tmpl w:val="C388E34E"/>
+    <w:lvl w:ilvl="0">
+      <w:start w:val="1"/>
+      <w:numFmt w:val="decimal"/>
+      <w:lvlText w:val="%1"/>
+      <w:lvlJc w:val="left"/>
+      <w:pPr>
+        <w:ind w:left="360" w:hanging="360"/>
+      </w:pPr>
+      <w:rPr>
+        <w:rFonts w:hint="default"/>
+      </w:rPr>
+    </w:lvl>
+    <w:lvl w:ilvl="1">
+      <w:start w:val="1"/>
+      <w:numFmt w:val="decimal"/>
+      <w:lvlText w:val="%1.%2"/>
+      <w:lvlJc w:val="left"/>
+      <w:pPr>
+        <w:ind w:left="360" w:hanging="360"/>
+      </w:pPr>
+      <w:rPr>
+        <w:rFonts w:hint="default"/>
+      </w:rPr>
+    </w:lvl>
+    <w:lvl w:ilvl="2">
+      <w:start w:val="1"/>
+      <w:numFmt w:val="decimal"/>
+      <w:lvlText w:val="%1.%2.%3"/>
+      <w:lvlJc w:val="left"/>
+      <w:pPr>
+        <w:ind w:left="720" w:hanging="720"/>
+      </w:pPr>
+      <w:rPr>
+        <w:rFonts w:hint="default"/>
+      </w:rPr>
+    </w:lvl>
+    <w:lvl w:ilvl="3">
+      <w:start w:val="1"/>
+      <w:numFmt w:val="decimal"/>
+      <w:lvlText w:val="%1.%2.%3.%4"/>
+      <w:lvlJc w:val="left"/>
+      <w:pPr>
+        <w:ind w:left="720" w:hanging="720"/>
+      </w:pPr>
+      <w:rPr>
+        <w:rFonts w:hint="default"/>
+      </w:rPr>
+    </w:lvl>
+    <w:lvl w:ilvl="4">
+      <w:start w:val="1"/>
+      <w:numFmt w:val="decimal"/>
+      <w:lvlText w:val="%1.%2.%3.%4.%5"/>
+      <w:lvlJc w:val="left"/>
+      <w:pPr>
+        <w:ind w:left="1080" w:hanging="1080"/>
+      </w:pPr>
+      <w:rPr>
+        <w:rFonts w:hint="default"/>
+      </w:rPr>
+    </w:lvl>
+    <w:lvl w:ilvl="5">
+      <w:start w:val="1"/>
+      <w:numFmt w:val="decimal"/>
+      <w:lvlText w:val="%1.%2.%3.%4.%5.%6"/>
+      <w:lvlJc w:val="left"/>
+      <w:pPr>
+        <w:ind w:left="1080" w:hanging="1080"/>
+      </w:pPr>
+      <w:rPr>
+        <w:rFonts w:hint="default"/>
+      </w:rPr>
+    </w:lvl>
+    <w:lvl w:ilvl="6">
+      <w:start w:val="1"/>
+      <w:numFmt w:val="decimal"/>
+      <w:lvlText w:val="%1.%2.%3.%4.%5.%6.%7"/>
+      <w:lvlJc w:val="left"/>
+      <w:pPr>
+        <w:ind w:left="1440" w:hanging="1440"/>
+      </w:pPr>
+      <w:rPr>
+        <w:rFonts w:hint="default"/>
+      </w:rPr>
+    </w:lvl>
+    <w:lvl w:ilvl="7">
+      <w:start w:val="1"/>
+      <w:numFmt w:val="decimal"/>
+      <w:lvlText w:val="%1.%2.%3.%4.%5.%6.%7.%8"/>
+      <w:lvlJc w:val="left"/>
+      <w:pPr>
+        <w:ind w:left="1440" w:hanging="1440"/>
+      </w:pPr>
+      <w:rPr>
+        <w:rFonts w:hint="default"/>
+      </w:rPr>
+    </w:lvl>
+    <w:lvl w:ilvl="8">
+      <w:start w:val="1"/>
+      <w:numFmt w:val="decimal"/>
+      <w:lvlText w:val="%1.%2.%3.%4.%5.%6.%7.%8.%9"/>
+      <w:lvlJc w:val="left"/>
+      <w:pPr>
+        <w:ind w:left="1800" w:hanging="1800"/>
+      </w:pPr>
+      <w:rPr>
+        <w:rFonts w:hint="default"/>
+      </w:rPr>
+    </w:lvl>
+  </w:abstractNum>
+  <w:num w:numId="1" w16cid:durableId="643123141">
+    <w:abstractNumId w:val="0"/>
+  </w:num>
+  <w:num w:numId="2" w16cid:durableId="1565798329">
+    <w:abstractNumId w:val="1"/>
+  </w:num>
+</w:numbering>
 </file>
 
 <file path=word/styles.xml><?xml version="1.0" encoding="utf-8"?>

</xml_diff>

<commit_message>
Existing Digital platforms and their shortcomings added
</commit_message>
<xml_diff>
--- a/Final Report.docx
+++ b/Final Report.docx
@@ -5108,6 +5108,132 @@
       </w:r>
       <w:r>
         <w:t>(World Health Organization,2021).</w:t>
+      </w:r>
+    </w:p>
+    <w:p>
+      <w:r>
+        <w:t>2.3 Existing Digital Health platforms and their Shortcomings</w:t>
+      </w:r>
+    </w:p>
+    <w:p>
+      <w:r>
+        <w:t xml:space="preserve">Researchers have conducted extensive studies about the current state of digital health platforms. The cross-sectional research of mobile health applications conducted in India </w:t>
+      </w:r>
+      <w:r>
+        <w:t>discovered that</w:t>
+      </w:r>
+      <w:r>
+        <w:t xml:space="preserve"> </w:t>
+      </w:r>
+      <w:proofErr w:type="spellStart"/>
+      <w:r>
+        <w:t>Practo</w:t>
+      </w:r>
+      <w:proofErr w:type="spellEnd"/>
+      <w:r>
+        <w:t xml:space="preserve">, </w:t>
+      </w:r>
+      <w:proofErr w:type="spellStart"/>
+      <w:proofErr w:type="gramStart"/>
+      <w:r>
+        <w:t>mfine</w:t>
+      </w:r>
+      <w:proofErr w:type="spellEnd"/>
+      <w:r>
+        <w:t xml:space="preserve">,  </w:t>
+      </w:r>
+      <w:proofErr w:type="spellStart"/>
+      <w:r>
+        <w:t>DocsApp</w:t>
+      </w:r>
+      <w:proofErr w:type="spellEnd"/>
+      <w:proofErr w:type="gramEnd"/>
+      <w:r>
+        <w:t>, and Lybrate emerged as the most popular</w:t>
+      </w:r>
+      <w:r>
+        <w:t xml:space="preserve"> applications </w:t>
+      </w:r>
+      <w:r>
+        <w:t>which provided users with</w:t>
+      </w:r>
+      <w:r>
+        <w:t xml:space="preserve"> consultation </w:t>
+      </w:r>
+      <w:r>
+        <w:lastRenderedPageBreak/>
+        <w:t xml:space="preserve">services through chat, audio and video communication </w:t>
+      </w:r>
+      <w:r>
+        <w:t>channels (</w:t>
+      </w:r>
+      <w:r>
+        <w:t>Agarwal and Biswas,2020).</w:t>
+      </w:r>
+      <w:r>
+        <w:t xml:space="preserve"> The study</w:t>
+      </w:r>
+      <w:r>
+        <w:t xml:space="preserve"> found that the platforms achieved extensive reach yet they possessed three major shortcomings, which included the absence of intelligent t</w:t>
+      </w:r>
+      <w:r>
+        <w:t xml:space="preserve">riage systems and the lack of verification procedures for listed practitioners and the failure to provide users with customized recommendations. A similar investigation on limitations of mobile healthcare applications that operate within sub-Saharan African medical systems showed that poor doctor-patient interaction design together with missing symptom-based specialist matching capabilities have weakened both </w:t>
+      </w:r>
+      <w:r>
+        <w:t>consultation</w:t>
+      </w:r>
+      <w:r>
+        <w:t xml:space="preserve"> effectiveness </w:t>
+      </w:r>
+      <w:r>
+        <w:t>and</w:t>
+      </w:r>
+      <w:r>
+        <w:t xml:space="preserve"> patient contentment-Nwabueze and </w:t>
+      </w:r>
+      <w:proofErr w:type="spellStart"/>
+      <w:proofErr w:type="gramStart"/>
+      <w:r>
+        <w:t>Oju</w:t>
+      </w:r>
+      <w:proofErr w:type="spellEnd"/>
+      <w:r>
+        <w:t>(</w:t>
+      </w:r>
+      <w:proofErr w:type="gramEnd"/>
+      <w:r>
+        <w:t>2019). Absence of regulatory oversight</w:t>
+      </w:r>
+      <w:r>
+        <w:t xml:space="preserve"> and</w:t>
+      </w:r>
+      <w:r>
+        <w:t xml:space="preserve"> </w:t>
+      </w:r>
+      <w:r>
+        <w:t>weak data protection measures were discovered</w:t>
+      </w:r>
+      <w:r>
+        <w:t xml:space="preserve"> in the evaluation of mobile medical applications </w:t>
+      </w:r>
+      <w:r>
+        <w:t xml:space="preserve">which endanger patient safety (Kamel </w:t>
+      </w:r>
+      <w:proofErr w:type="spellStart"/>
+      <w:r>
+        <w:t>Boulous</w:t>
+      </w:r>
+      <w:proofErr w:type="spellEnd"/>
+      <w:r>
+        <w:t xml:space="preserve"> </w:t>
+      </w:r>
+      <w:proofErr w:type="gramStart"/>
+      <w:r>
+        <w:t>et.al(</w:t>
+      </w:r>
+      <w:proofErr w:type="gramEnd"/>
+      <w:r>
+        <w:t>2014)). These studies revealed that none of the existing platform has implanted AI for specialist recommendation system along with the authentication of verified doctors and blockchain-protected medical data into one complete system. This project aims to develop this particular solution.</w:t>
       </w:r>
     </w:p>
     <w:p/>

</xml_diff>

<commit_message>
AI and Machinelearning added in report
</commit_message>
<xml_diff>
--- a/Final Report.docx
+++ b/Final Report.docx
@@ -5236,6 +5236,49 @@
         <w:t>2014)). These studies revealed that none of the existing platform has implanted AI for specialist recommendation system along with the authentication of verified doctors and blockchain-protected medical data into one complete system. This project aims to develop this particular solution.</w:t>
       </w:r>
     </w:p>
+    <w:p>
+      <w:r>
+        <w:t xml:space="preserve">2.4 </w:t>
+      </w:r>
+      <w:r>
+        <w:t>Artificial</w:t>
+      </w:r>
+      <w:r>
+        <w:t xml:space="preserve"> Intelligence and Machine Learning for personalized Recommendation</w:t>
+      </w:r>
+    </w:p>
+    <w:p>
+      <w:r>
+        <w:t xml:space="preserve">The detailed study found that machine learning algorithms like random forests, neural networks and support vector machine models have a high degree accuracy in diverse clinical domains where they outperform human triaging in many instances (Ahsab et. al (2022). The personalized mapping of symptoms to disease through a recommendation system using machine learning accurately recommends medical experts with a 97% accuracy rate which exceeds those achieved through traditional self-referral processes (Hassan and </w:t>
+      </w:r>
+      <w:proofErr w:type="gramStart"/>
+      <w:r>
+        <w:t>Elagamy(</w:t>
+      </w:r>
+      <w:proofErr w:type="gramEnd"/>
+      <w:r>
+        <w:t>2025). Artificial intelligence in medicine is moving away from specialized AI applications to clinical decision-making systems that continuously learn from interactions with patients (Guo et al. (2024)).</w:t>
+      </w:r>
+      <w:r>
+        <w:t xml:space="preserve"> AI recommendations are unreliable in unbalanced datasets with demographic considerations </w:t>
+      </w:r>
+      <w:proofErr w:type="gramStart"/>
+      <w:r>
+        <w:t>overlooked(</w:t>
+      </w:r>
+      <w:proofErr w:type="gramEnd"/>
+      <w:r>
+        <w:t xml:space="preserve">Iqbal </w:t>
+      </w:r>
+      <w:proofErr w:type="gramStart"/>
+      <w:r>
+        <w:t>et al.(</w:t>
+      </w:r>
+      <w:proofErr w:type="gramEnd"/>
+      <w:r>
+        <w:t xml:space="preserve">2024). </w:t>
+      </w:r>
+    </w:p>
     <w:p/>
     <w:p/>
     <w:p/>
@@ -5261,7 +5304,6 @@
       </w:pPr>
       <w:bookmarkStart w:id="9" w:name="_Toc226061231"/>
       <w:r>
-        <w:lastRenderedPageBreak/>
         <w:t>Chapter 3: Review of Technology</w:t>
       </w:r>
       <w:bookmarkEnd w:id="9"/>
@@ -5548,6 +5590,7 @@
                 <w:rPr>
                   <w:noProof/>
                 </w:rPr>
+                <w:lastRenderedPageBreak/>
                 <w:t xml:space="preserve">Schwaber, K. &amp; Sutherland, J., 2020. The Definitive Guide to Scrum: The Rules of the Game. </w:t>
               </w:r>
               <w:r>
@@ -5622,7 +5665,6 @@
       </w:pPr>
       <w:bookmarkStart w:id="18" w:name="_Toc226061240"/>
       <w:r>
-        <w:lastRenderedPageBreak/>
         <w:t>Appendices</w:t>
       </w:r>
       <w:bookmarkEnd w:id="18"/>

</xml_diff>

<commit_message>
Blockchain Added in Report
</commit_message>
<xml_diff>
--- a/Final Report.docx
+++ b/Final Report.docx
@@ -5249,34 +5249,143 @@
     </w:p>
     <w:p>
       <w:r>
-        <w:t xml:space="preserve">The detailed study found that machine learning algorithms like random forests, neural networks and support vector machine models have a high degree accuracy in diverse clinical domains where they outperform human triaging in many instances (Ahsab et. al (2022). The personalized mapping of symptoms to disease through a recommendation system using machine learning accurately recommends medical experts with a 97% accuracy rate which exceeds those achieved through traditional self-referral processes (Hassan and </w:t>
+        <w:t xml:space="preserve">The detailed study found that machine learning algorithms like random forests, neural networks and support vector machine models have a high degree accuracy in diverse clinical domains where they outperform human triaging in many instances (Ahsab et. al (2022). The personalized </w:t>
+      </w:r>
+      <w:r>
+        <w:t xml:space="preserve">symptom-disease </w:t>
+      </w:r>
+      <w:r>
+        <w:t xml:space="preserve">mapping </w:t>
+      </w:r>
+      <w:r>
+        <w:t xml:space="preserve">using </w:t>
+      </w:r>
+      <w:r>
+        <w:t xml:space="preserve">recommendation system </w:t>
+      </w:r>
+      <w:r>
+        <w:t>with</w:t>
+      </w:r>
+      <w:r>
+        <w:t xml:space="preserve"> machine learning</w:t>
+      </w:r>
+      <w:r>
+        <w:t xml:space="preserve"> algorithms</w:t>
+      </w:r>
+      <w:r>
+        <w:t xml:space="preserve"> </w:t>
+      </w:r>
+      <w:r>
+        <w:t xml:space="preserve">is </w:t>
+      </w:r>
+      <w:r>
+        <w:t>quite</w:t>
+      </w:r>
+      <w:r>
+        <w:t xml:space="preserve"> accurate</w:t>
+      </w:r>
+      <w:r>
+        <w:t xml:space="preserve"> with a 97% accuracy rate which </w:t>
+      </w:r>
+      <w:r>
+        <w:t xml:space="preserve">is better than the </w:t>
+      </w:r>
+      <w:r>
+        <w:t>result achieved</w:t>
+      </w:r>
+      <w:r>
+        <w:t xml:space="preserve"> through traditional self-refer</w:t>
+      </w:r>
+      <w:r>
+        <w:t>ence</w:t>
+      </w:r>
+      <w:r>
+        <w:t xml:space="preserve"> processes (Hassan and Elagamy</w:t>
+      </w:r>
+      <w:r>
+        <w:t xml:space="preserve"> </w:t>
+      </w:r>
+      <w:r>
+        <w:t xml:space="preserve">(2025). </w:t>
+      </w:r>
+      <w:r>
+        <w:t>The field of AI with</w:t>
+      </w:r>
+      <w:r>
+        <w:t xml:space="preserve">in medicine </w:t>
+      </w:r>
+      <w:r>
+        <w:t xml:space="preserve">has diverted its focus from specific AI models to clinical decision-making system which is continuously improved based on the interactions with their clients </w:t>
+      </w:r>
+      <w:r>
+        <w:t>(Guo et al. (2024)).</w:t>
+      </w:r>
+      <w:r>
+        <w:t xml:space="preserve"> </w:t>
+      </w:r>
+      <w:r>
+        <w:t>R</w:t>
+      </w:r>
+      <w:r>
+        <w:t xml:space="preserve">ecommendations </w:t>
+      </w:r>
+      <w:r>
+        <w:t>made by AI models cannot be considered reliable if they are applied to imbalanced datasets that do not consider some demographics (</w:t>
+      </w:r>
+      <w:r>
+        <w:t xml:space="preserve">Iqbal </w:t>
       </w:r>
       <w:proofErr w:type="gramStart"/>
       <w:r>
-        <w:t>Elagamy(</w:t>
+        <w:t>et al.(</w:t>
       </w:r>
       <w:proofErr w:type="gramEnd"/>
       <w:r>
-        <w:t>2025). Artificial intelligence in medicine is moving away from specialized AI applications to clinical decision-making systems that continuously learn from interactions with patients (Guo et al. (2024)).</w:t>
-      </w:r>
-      <w:r>
-        <w:t xml:space="preserve"> AI recommendations are unreliable in unbalanced datasets with demographic considerations </w:t>
-      </w:r>
-      <w:proofErr w:type="gramStart"/>
-      <w:r>
-        <w:t>overlooked(</w:t>
-      </w:r>
-      <w:proofErr w:type="gramEnd"/>
-      <w:r>
-        <w:t xml:space="preserve">Iqbal </w:t>
-      </w:r>
-      <w:proofErr w:type="gramStart"/>
-      <w:r>
-        <w:t>et al.(</w:t>
-      </w:r>
-      <w:proofErr w:type="gramEnd"/>
-      <w:r>
         <w:t xml:space="preserve">2024). </w:t>
+      </w:r>
+      <w:r>
+        <w:t>To address this, Kaggle symptom-disease datasets are preprocessed to ensure balance representation before training.</w:t>
+      </w:r>
+    </w:p>
+    <w:p>
+      <w:r>
+        <w:t>2.5 Blockchain technology for the Security of Medical Records</w:t>
+      </w:r>
+    </w:p>
+    <w:p>
+      <w:r>
+        <w:t xml:space="preserve">The security of patient data is still a concern in digital healthcare. </w:t>
+      </w:r>
+      <w:r>
+        <w:t>Over 133 million patient records have been breached in 2023 which especially highlights the importance of Blockchain (</w:t>
+      </w:r>
+      <w:proofErr w:type="spellStart"/>
+      <w:r>
+        <w:t>Daaloul</w:t>
+      </w:r>
+      <w:proofErr w:type="spellEnd"/>
+      <w:r>
+        <w:t xml:space="preserve"> et al.,2023). </w:t>
+      </w:r>
+      <w:r>
+        <w:t>A decentralized structure is provided by Blockchain creating tamper-proof records which do not require verification of data through central authorities (Mougayar,2016). Decentralized blockchain networks minimize the risks of illegal data changes</w:t>
+      </w:r>
+      <w:r>
+        <w:t xml:space="preserve"> to protect the privacy of patients (</w:t>
+      </w:r>
+      <w:proofErr w:type="spellStart"/>
+      <w:r>
+        <w:t>kiania</w:t>
+      </w:r>
+      <w:proofErr w:type="spellEnd"/>
+      <w:r>
+        <w:t xml:space="preserve"> et al. (2023))</w:t>
+      </w:r>
+      <w:r>
+        <w:t>.</w:t>
+      </w:r>
+      <w:r>
+        <w:t xml:space="preserve"> In this project Blockchain is employed to store prescription for patients and verification of doctor to ensure data integrity.</w:t>
       </w:r>
     </w:p>
     <w:p/>
@@ -5512,6 +5621,7 @@
                 <w:rPr>
                   <w:noProof/>
                 </w:rPr>
+                <w:lastRenderedPageBreak/>
                 <w:t xml:space="preserve">Bin, K. J. et al., 2021. Building an outpatient telemedicine care pilot using Scrum-like framework within a medical residency program. </w:t>
               </w:r>
             </w:p>
@@ -5590,7 +5700,6 @@
                 <w:rPr>
                   <w:noProof/>
                 </w:rPr>
-                <w:lastRenderedPageBreak/>
                 <w:t xml:space="preserve">Schwaber, K. &amp; Sutherland, J., 2020. The Definitive Guide to Scrum: The Rules of the Game. </w:t>
               </w:r>
               <w:r>

</xml_diff>

<commit_message>
Location-based service access added in report
</commit_message>
<xml_diff>
--- a/Final Report.docx
+++ b/Final Report.docx
@@ -5388,6 +5388,61 @@
         <w:t xml:space="preserve"> In this project Blockchain is employed to store prescription for patients and verification of doctor to ensure data integrity.</w:t>
       </w:r>
     </w:p>
+    <w:p>
+      <w:r>
+        <w:t>2.6 Location-Based Services in Healthcare Access</w:t>
+      </w:r>
+    </w:p>
+    <w:p>
+      <w:r>
+        <w:t xml:space="preserve">The integration of location-based service in healthcare platform is an interesting topic for researchers. Researchers have found that </w:t>
+      </w:r>
+      <w:r>
+        <w:t>indicating</w:t>
+      </w:r>
+      <w:r>
+        <w:t xml:space="preserve"> nearby hospitals or pharmacies would be highly beneficial for regions with insufficient</w:t>
+      </w:r>
+      <w:r>
+        <w:t xml:space="preserve"> healthcare infrastructure</w:t>
+      </w:r>
+      <w:r>
+        <w:t xml:space="preserve"> (</w:t>
+      </w:r>
+      <w:r>
+        <w:t>Ismail et al.,2024)</w:t>
+      </w:r>
+      <w:r>
+        <w:t xml:space="preserve">. </w:t>
+      </w:r>
+      <w:r>
+        <w:t xml:space="preserve">According to some research results, individuals who find it easy to locate any health care services would seek for medical care sooner than people who find difficulties in locating such </w:t>
+      </w:r>
+      <w:r>
+        <w:t>c</w:t>
+      </w:r>
+      <w:r>
+        <w:t>enters</w:t>
+      </w:r>
+      <w:r>
+        <w:t xml:space="preserve"> </w:t>
+      </w:r>
+      <w:r>
+        <w:t xml:space="preserve">(World Health Organization,2023). OpenStreetMap is one of the open-source mapping solutions that provides reliable and accurate map functionality which is a practical choice </w:t>
+      </w:r>
+      <w:r>
+        <w:t>for an</w:t>
+      </w:r>
+      <w:r>
+        <w:t xml:space="preserve"> academic </w:t>
+      </w:r>
+      <w:r>
+        <w:t>project (</w:t>
+      </w:r>
+      <w:r>
+        <w:t>OpenStreetMap Contriburors,2024).</w:t>
+      </w:r>
+    </w:p>
     <w:p/>
     <w:p/>
     <w:p/>
@@ -5413,6 +5468,7 @@
       </w:pPr>
       <w:bookmarkStart w:id="9" w:name="_Toc226061231"/>
       <w:r>
+        <w:lastRenderedPageBreak/>
         <w:t>Chapter 3: Review of Technology</w:t>
       </w:r>
       <w:bookmarkEnd w:id="9"/>
@@ -5621,7 +5677,6 @@
                 <w:rPr>
                   <w:noProof/>
                 </w:rPr>
-                <w:lastRenderedPageBreak/>
                 <w:t xml:space="preserve">Bin, K. J. et al., 2021. Building an outpatient telemedicine care pilot using Scrum-like framework within a medical residency program. </w:t>
               </w:r>
             </w:p>
@@ -5774,6 +5829,7 @@
       </w:pPr>
       <w:bookmarkStart w:id="18" w:name="_Toc226061240"/>
       <w:r>
+        <w:lastRenderedPageBreak/>
         <w:t>Appendices</w:t>
       </w:r>
       <w:bookmarkEnd w:id="18"/>

</xml_diff>